<commit_message>
Update all CV files with latest versions
</commit_message>
<xml_diff>
--- a/assets/cvs/Back-End Laravel/Assem_habib_CV_Laravel.docx
+++ b/assets/cvs/Back-End Laravel/Assem_habib_CV_Laravel.docx
@@ -122,6 +122,27 @@
           <w:t>assem-habib-5236a423b</w:t>
         </w:r>
       </w:hyperlink>
+      <w:r>
+        <w:br/>
+      </w:r>
+      <w:r>
+        <w:rPr>
+          <w:b/>
+          <w:bCs/>
+        </w:rPr>
+        <w:t>Portifolio</w:t>
+      </w:r>
+      <w:r>
+        <w:t xml:space="preserve">: </w:t>
+      </w:r>
+      <w:hyperlink r:id="rId7" w:history="1">
+        <w:r>
+          <w:rPr>
+            <w:rStyle w:val="Hyperlink"/>
+          </w:rPr>
+          <w:t>assem2023-habib/portifolio</w:t>
+        </w:r>
+      </w:hyperlink>
     </w:p>
     <w:p>
       <w:pPr>
@@ -178,7 +199,180 @@
           <w:rFonts w:ascii="Calibri" w:hAnsi="Calibri" w:cs="Calibri"/>
         </w:rPr>
         <w:pict w14:anchorId="35735D98">
-          <v:rect id="_x0000_i1035" style="width:0;height:1.5pt" o:hralign="center" o:hrstd="t" o:hr="t" fillcolor="#a0a0a0" stroked="f"/>
+          <v:rect id="_x0000_i1026" style="width:0;height:1.5pt" o:hralign="center" o:hrstd="t" o:hr="t" fillcolor="#a0a0a0" stroked="f"/>
+        </w:pict>
+      </w:r>
+      <w:r>
+        <w:rPr>
+          <w:rFonts w:ascii="Calibri" w:hAnsi="Calibri" w:cs="Calibri"/>
+        </w:rPr>
+        <w:t xml:space="preserve"> </w:t>
+      </w:r>
+    </w:p>
+    <w:p>
+      <w:pPr>
+        <w:rPr>
+          <w:rFonts w:ascii="Calibri" w:hAnsi="Calibri" w:cs="Calibri"/>
+          <w:b/>
+          <w:bCs/>
+        </w:rPr>
+      </w:pPr>
+      <w:r>
+        <w:rPr>
+          <w:rFonts w:ascii="Calibri" w:hAnsi="Calibri" w:cs="Calibri"/>
+          <w:b/>
+          <w:bCs/>
+        </w:rPr>
+        <w:t>EXPERIENCE</w:t>
+      </w:r>
+      <w:r>
+        <w:rPr>
+          <w:rFonts w:ascii="Calibri" w:hAnsi="Calibri" w:cs="Calibri"/>
+          <w:b/>
+          <w:bCs/>
+        </w:rPr>
+        <w:t>:</w:t>
+      </w:r>
+    </w:p>
+    <w:p>
+      <w:pPr>
+        <w:rPr>
+          <w:rFonts w:ascii="Calibri" w:hAnsi="Calibri" w:cs="Calibri"/>
+          <w:b/>
+          <w:bCs/>
+        </w:rPr>
+      </w:pPr>
+      <w:r>
+        <w:rPr>
+          <w:rFonts w:ascii="Calibri" w:hAnsi="Calibri" w:cs="Calibri"/>
+          <w:b/>
+          <w:bCs/>
+        </w:rPr>
+        <w:t>Freelance Laravel Developer | Remote</w:t>
+      </w:r>
+      <w:r>
+        <w:rPr>
+          <w:rFonts w:ascii="Calibri" w:hAnsi="Calibri" w:cs="Calibri"/>
+          <w:b/>
+          <w:bCs/>
+        </w:rPr>
+        <w:t>:</w:t>
+      </w:r>
+    </w:p>
+    <w:p>
+      <w:pPr>
+        <w:rPr>
+          <w:rFonts w:ascii="Calibri" w:hAnsi="Calibri" w:cs="Calibri"/>
+        </w:rPr>
+      </w:pPr>
+      <w:r>
+        <w:rPr>
+          <w:rFonts w:ascii="Calibri" w:hAnsi="Calibri" w:cs="Calibri"/>
+        </w:rPr>
+        <w:t xml:space="preserve">  </w:t>
+      </w:r>
+      <w:r>
+        <w:rPr>
+          <w:rFonts w:ascii="Calibri" w:hAnsi="Calibri" w:cs="Calibri"/>
+        </w:rPr>
+        <w:t xml:space="preserve">• Developed web applications and </w:t>
+      </w:r>
+      <w:r>
+        <w:rPr>
+          <w:rFonts w:ascii="Calibri" w:hAnsi="Calibri" w:cs="Calibri"/>
+          <w:b/>
+          <w:bCs/>
+        </w:rPr>
+        <w:t>RESTful</w:t>
+      </w:r>
+      <w:r>
+        <w:rPr>
+          <w:rFonts w:ascii="Calibri" w:hAnsi="Calibri" w:cs="Calibri"/>
+        </w:rPr>
+        <w:t xml:space="preserve"> APIs using Laravel and </w:t>
+      </w:r>
+      <w:r>
+        <w:rPr>
+          <w:rFonts w:ascii="Calibri" w:hAnsi="Calibri" w:cs="Calibri"/>
+          <w:b/>
+          <w:bCs/>
+        </w:rPr>
+        <w:t>PHP</w:t>
+      </w:r>
+      <w:r>
+        <w:rPr>
+          <w:rFonts w:ascii="Calibri" w:hAnsi="Calibri" w:cs="Calibri"/>
+        </w:rPr>
+        <w:t>.</w:t>
+      </w:r>
+      <w:r>
+        <w:rPr>
+          <w:rFonts w:ascii="Calibri" w:hAnsi="Calibri" w:cs="Calibri"/>
+        </w:rPr>
+        <w:br/>
+      </w:r>
+      <w:r>
+        <w:rPr>
+          <w:rFonts w:ascii="Calibri" w:hAnsi="Calibri" w:cs="Calibri"/>
+        </w:rPr>
+        <w:t xml:space="preserve">  </w:t>
+      </w:r>
+      <w:r>
+        <w:rPr>
+          <w:rFonts w:ascii="Calibri" w:hAnsi="Calibri" w:cs="Calibri"/>
+        </w:rPr>
+        <w:t>• Built authentication systems, role-based access control, and database-driven solutions.</w:t>
+      </w:r>
+      <w:r>
+        <w:rPr>
+          <w:rFonts w:ascii="Calibri" w:hAnsi="Calibri" w:cs="Calibri"/>
+        </w:rPr>
+        <w:br/>
+      </w:r>
+      <w:r>
+        <w:rPr>
+          <w:rFonts w:ascii="Calibri" w:hAnsi="Calibri" w:cs="Calibri"/>
+        </w:rPr>
+        <w:t xml:space="preserve">  </w:t>
+      </w:r>
+      <w:r>
+        <w:rPr>
+          <w:rFonts w:ascii="Calibri" w:hAnsi="Calibri" w:cs="Calibri"/>
+        </w:rPr>
+        <w:t>• Designed and maintained MySQL databases and backend workflows.</w:t>
+      </w:r>
+      <w:r>
+        <w:rPr>
+          <w:rFonts w:ascii="Calibri" w:hAnsi="Calibri" w:cs="Calibri"/>
+        </w:rPr>
+        <w:br/>
+      </w:r>
+      <w:r>
+        <w:rPr>
+          <w:rFonts w:ascii="Calibri" w:hAnsi="Calibri" w:cs="Calibri"/>
+        </w:rPr>
+        <w:t xml:space="preserve">  </w:t>
+      </w:r>
+      <w:r>
+        <w:rPr>
+          <w:rFonts w:ascii="Calibri" w:hAnsi="Calibri" w:cs="Calibri"/>
+        </w:rPr>
+        <w:t>• Delivered client-focused solutions from development to deployment.</w:t>
+      </w:r>
+      <w:r>
+        <w:rPr>
+          <w:rFonts w:ascii="Calibri" w:hAnsi="Calibri" w:cs="Calibri"/>
+          <w:b/>
+          <w:bCs/>
+        </w:rPr>
+        <w:br/>
+      </w:r>
+      <w:r>
+        <w:rPr>
+          <w:rFonts w:ascii="Calibri" w:hAnsi="Calibri" w:cs="Calibri"/>
+        </w:rPr>
+        <w:pict w14:anchorId="160EB05C">
+          <v:rect id="_x0000_i1027" style="width:0;height:1.5pt" o:hralign="center" o:hrstd="t" o:hr="t" fillcolor="#a0a0a0" stroked="f"/>
         </w:pict>
       </w:r>
     </w:p>
@@ -383,7 +577,7 @@
           <w:rFonts w:ascii="Calibri" w:hAnsi="Calibri" w:cs="Calibri"/>
         </w:rPr>
         <w:pict w14:anchorId="25DA70F4">
-          <v:rect id="_x0000_i1027" style="width:0;height:1.5pt" o:hralign="center" o:hrstd="t" o:hr="t" fillcolor="#a0a0a0" stroked="f"/>
+          <v:rect id="_x0000_i1028" style="width:0;height:1.5pt" o:hralign="center" o:hrstd="t" o:hr="t" fillcolor="#a0a0a0" stroked="f"/>
         </w:pict>
       </w:r>
     </w:p>
@@ -442,7 +636,7 @@
         <w:rPr>
           <w:rFonts w:ascii="Calibri" w:hAnsi="Calibri" w:cs="Calibri"/>
         </w:rPr>
-        <w:t xml:space="preserve">Developed a scalable parcel delivery management system using </w:t>
+        <w:t xml:space="preserve">Developed a parcel delivery management system using </w:t>
       </w:r>
       <w:r>
         <w:rPr>
@@ -456,7 +650,29 @@
         <w:rPr>
           <w:rFonts w:ascii="Calibri" w:hAnsi="Calibri" w:cs="Calibri"/>
         </w:rPr>
-        <w:t xml:space="preserve"> and RESTful APIs</w:t>
+        <w:t xml:space="preserve"> and </w:t>
+      </w:r>
+      <w:r>
+        <w:rPr>
+          <w:rFonts w:ascii="Calibri" w:hAnsi="Calibri" w:cs="Calibri"/>
+          <w:b/>
+          <w:bCs/>
+        </w:rPr>
+        <w:t>REST</w:t>
+      </w:r>
+      <w:r>
+        <w:rPr>
+          <w:rFonts w:ascii="Calibri" w:hAnsi="Calibri" w:cs="Calibri"/>
+        </w:rPr>
+        <w:t xml:space="preserve"> </w:t>
+      </w:r>
+      <w:r>
+        <w:rPr>
+          <w:rFonts w:ascii="Calibri" w:hAnsi="Calibri" w:cs="Calibri"/>
+          <w:b/>
+          <w:bCs/>
+        </w:rPr>
+        <w:t>APIs</w:t>
       </w:r>
       <w:r>
         <w:rPr>
@@ -479,7 +695,8 @@
         <w:rPr>
           <w:rFonts w:ascii="Calibri" w:hAnsi="Calibri" w:cs="Calibri"/>
         </w:rPr>
-        <w:t>Designed and implemented core backend features including shipment tracking, order management, and role-based access control</w:t>
+        <w:lastRenderedPageBreak/>
+        <w:t>Implemented shipment tracking, order management, and role-based access control</w:t>
       </w:r>
       <w:r>
         <w:rPr>
@@ -502,31 +719,7 @@
         <w:rPr>
           <w:rFonts w:ascii="Calibri" w:hAnsi="Calibri" w:cs="Calibri"/>
         </w:rPr>
-        <w:lastRenderedPageBreak/>
-        <w:t>Built a real-time tracking system to monitor parcel status and improve delivery transparency</w:t>
-      </w:r>
-      <w:r>
-        <w:rPr>
-          <w:rFonts w:ascii="Calibri" w:hAnsi="Calibri" w:cs="Calibri"/>
-        </w:rPr>
-        <w:t>.</w:t>
-      </w:r>
-    </w:p>
-    <w:p>
-      <w:pPr>
-        <w:numPr>
-          <w:ilvl w:val="0"/>
-          <w:numId w:val="2"/>
-        </w:numPr>
-        <w:rPr>
-          <w:rFonts w:ascii="Calibri" w:hAnsi="Calibri" w:cs="Calibri"/>
-        </w:rPr>
-      </w:pPr>
-      <w:r>
-        <w:rPr>
-          <w:rFonts w:ascii="Calibri" w:hAnsi="Calibri" w:cs="Calibri"/>
-        </w:rPr>
-        <w:t>Contributed to system documentation and workflow optimization, improving onboarding efficiency for delivery operations</w:t>
+        <w:t>Built real-time parcel status tracking and workflow management features</w:t>
       </w:r>
       <w:r>
         <w:rPr>
@@ -564,29 +757,7 @@
         <w:rPr>
           <w:rFonts w:ascii="Calibri" w:hAnsi="Calibri" w:cs="Calibri"/>
         </w:rPr>
-        <w:t xml:space="preserve">Built a full-featured e-commerce platform using </w:t>
-      </w:r>
-      <w:r>
-        <w:rPr>
-          <w:rFonts w:ascii="Calibri" w:hAnsi="Calibri" w:cs="Calibri"/>
-          <w:b/>
-          <w:bCs/>
-        </w:rPr>
-        <w:t>Laravel</w:t>
-      </w:r>
-      <w:r>
-        <w:rPr>
-          <w:rFonts w:ascii="Calibri" w:hAnsi="Calibri" w:cs="Calibri"/>
-        </w:rPr>
-        <w:t xml:space="preserve"> and </w:t>
-      </w:r>
-      <w:r>
-        <w:rPr>
-          <w:rFonts w:ascii="Calibri" w:hAnsi="Calibri" w:cs="Calibri"/>
-          <w:b/>
-          <w:bCs/>
-        </w:rPr>
-        <w:t>Blade templating engine</w:t>
+        <w:t>Developed an e-commerce platform using Laravel and Blade</w:t>
       </w:r>
       <w:r>
         <w:rPr>
@@ -609,7 +780,7 @@
         <w:rPr>
           <w:rFonts w:ascii="Calibri" w:hAnsi="Calibri" w:cs="Calibri"/>
         </w:rPr>
-        <w:t>Developed core modules including product management, shopping cart, billing system, and user management</w:t>
+        <w:t>Implemented product management, shopping cart, billing, and user management modules</w:t>
       </w:r>
       <w:r>
         <w:rPr>
@@ -632,30 +803,7 @@
         <w:rPr>
           <w:rFonts w:ascii="Calibri" w:hAnsi="Calibri" w:cs="Calibri"/>
         </w:rPr>
-        <w:t>Implemented admin dashboard with full CRUD operations for managing platform data</w:t>
-      </w:r>
-      <w:r>
-        <w:rPr>
-          <w:rFonts w:ascii="Calibri" w:hAnsi="Calibri" w:cs="Calibri"/>
-        </w:rPr>
-        <w:t>.</w:t>
-      </w:r>
-    </w:p>
-    <w:p>
-      <w:pPr>
-        <w:numPr>
-          <w:ilvl w:val="0"/>
-          <w:numId w:val="3"/>
-        </w:numPr>
-        <w:rPr>
-          <w:rFonts w:ascii="Calibri" w:hAnsi="Calibri" w:cs="Calibri"/>
-        </w:rPr>
-      </w:pPr>
-      <w:r>
-        <w:rPr>
-          <w:rFonts w:ascii="Calibri" w:hAnsi="Calibri" w:cs="Calibri"/>
-        </w:rPr>
-        <w:t>Integrated multi-language support (Arabic/English) and SEO optimization for improved accessibility and visibility</w:t>
+        <w:t>Built an admin dashboard with CRUD operations and multilingual support</w:t>
       </w:r>
       <w:r>
         <w:rPr>
@@ -887,7 +1035,7 @@
           <w:numId w:val="5"/>
         </w:numPr>
         <w:rPr>
-          <w:rFonts w:ascii="Calibri" w:hAnsi="Calibri" w:cs="Calibri" w:hint="cs"/>
+          <w:rFonts w:ascii="Calibri" w:hAnsi="Calibri" w:cs="Calibri"/>
           <w:rtl/>
         </w:rPr>
       </w:pPr>
@@ -909,7 +1057,7 @@
           <w:rFonts w:ascii="Calibri" w:hAnsi="Calibri" w:cs="Calibri"/>
         </w:rPr>
         <w:pict w14:anchorId="482C0739">
-          <v:rect id="_x0000_i1040" style="width:0;height:1.5pt" o:hralign="center" o:hrstd="t" o:hr="t" fillcolor="#a0a0a0" stroked="f"/>
+          <v:rect id="_x0000_i1029" style="width:0;height:1.5pt" o:hralign="center" o:hrstd="t" o:hr="t" fillcolor="#a0a0a0" stroked="f"/>
         </w:pict>
       </w:r>
     </w:p>
@@ -927,7 +1075,6 @@
           <w:b/>
           <w:bCs/>
         </w:rPr>
-        <w:lastRenderedPageBreak/>
         <w:t>Education</w:t>
       </w:r>
     </w:p>
@@ -986,7 +1133,7 @@
           <w:rFonts w:ascii="Calibri" w:hAnsi="Calibri" w:cs="Calibri"/>
         </w:rPr>
         <w:pict w14:anchorId="5C1DF397">
-          <v:rect id="_x0000_i1029" style="width:0;height:1.5pt" o:hralign="center" o:hrstd="t" o:hr="t" fillcolor="#a0a0a0" stroked="f"/>
+          <v:rect id="_x0000_i1030" style="width:0;height:1.5pt" o:hralign="center" o:hrstd="t" o:hr="t" fillcolor="#a0a0a0" stroked="f"/>
         </w:pict>
       </w:r>
     </w:p>
@@ -1066,7 +1213,7 @@
     </w:p>
     <w:sectPr>
       <w:pgSz w:w="12240" w:h="15840"/>
-      <w:pgMar w:top="1440" w:right="1800" w:bottom="1440" w:left="1800" w:header="708" w:footer="708" w:gutter="0"/>
+      <w:pgMar w:top="648" w:right="648" w:bottom="648" w:left="648" w:header="706" w:footer="706" w:gutter="0"/>
       <w:cols w:space="708"/>
       <w:docGrid w:linePitch="360"/>
     </w:sectPr>
@@ -2918,6 +3065,18 @@
       <w:u w:val="single"/>
     </w:rPr>
   </w:style>
+  <w:style w:type="character" w:styleId="UnresolvedMention">
+    <w:name w:val="Unresolved Mention"/>
+    <w:basedOn w:val="DefaultParagraphFont"/>
+    <w:uiPriority w:val="99"/>
+    <w:semiHidden/>
+    <w:unhideWhenUsed/>
+    <w:rsid w:val="00CE0DEF"/>
+    <w:rPr>
+      <w:color w:val="605E5C"/>
+      <w:shd w:val="clear" w:color="auto" w:fill="E1DFDD"/>
+    </w:rPr>
+  </w:style>
 </w:styles>
 </file>
 

</xml_diff>